<commit_message>
Remove embedded fonts and upgrade Libreoffice version of every document
</commit_message>
<xml_diff>
--- a/documents/Nose Jewels Bracelets/Manners & Customs of the Bible - Genesis - Nose Jewels Bracelets.docx
+++ b/documents/Nose Jewels Bracelets/Manners & Customs of the Bible - Genesis - Nose Jewels Bracelets.docx
@@ -1,12 +1,12 @@
 
 <file path=word/document.xml><?xml version="1.0" encoding="utf-8"?>
-<w:document xmlns:o="urn:schemas-microsoft-com:office:office" xmlns:r="http://schemas.openxmlformats.org/officeDocument/2006/relationships" xmlns:v="urn:schemas-microsoft-com:vml" xmlns:w="http://schemas.openxmlformats.org/wordprocessingml/2006/main" xmlns:w10="urn:schemas-microsoft-com:office:word" xmlns:wp="http://schemas.openxmlformats.org/drawingml/2006/wordprocessingDrawing" xmlns:wps="http://schemas.microsoft.com/office/word/2010/wordprocessingShape" xmlns:wpg="http://schemas.microsoft.com/office/word/2010/wordprocessingGroup" xmlns:mc="http://schemas.openxmlformats.org/markup-compatibility/2006" xmlns:wp14="http://schemas.microsoft.com/office/word/2010/wordprocessingDrawing" xmlns:w14="http://schemas.microsoft.com/office/word/2010/wordml" xmlns:w15="http://schemas.microsoft.com/office/word/2012/wordml" mc:Ignorable="w14 wp14 w15">
+<w:document xmlns:o="urn:schemas-microsoft-com:office:office" xmlns:r="http://schemas.openxmlformats.org/officeDocument/2006/relationships" xmlns:v="urn:schemas-microsoft-com:vml" xmlns:w="http://schemas.openxmlformats.org/wordprocessingml/2006/main" xmlns:w10="urn:schemas-microsoft-com:office:word" xmlns:wp="http://schemas.openxmlformats.org/drawingml/2006/wordprocessingDrawing" xmlns:pic="http://schemas.openxmlformats.org/drawingml/2006/picture" xmlns:wps="http://schemas.microsoft.com/office/word/2010/wordprocessingShape" xmlns:wpg="http://schemas.microsoft.com/office/word/2010/wordprocessingGroup" xmlns:mc="http://schemas.openxmlformats.org/markup-compatibility/2006" xmlns:wp14="http://schemas.microsoft.com/office/word/2010/wordprocessingDrawing" xmlns:w14="http://schemas.microsoft.com/office/word/2010/wordml" xmlns:w15="http://schemas.microsoft.com/office/word/2012/wordml" mc:Ignorable="w14 wp14 w15">
   <w:body>
     <w:p>
       <w:pPr>
         <w:pStyle w:val="Normal"/>
         <w:bidi w:val="0"/>
-        <w:jc w:val="left"/>
+        <w:jc w:val="start"/>
         <w:rPr/>
       </w:pPr>
       <w:r>
@@ -18,18 +18,18 @@
       <w:pPr>
         <w:pStyle w:val="Normal"/>
         <w:bidi w:val="0"/>
-        <w:jc w:val="left"/>
-        <w:rPr/>
-      </w:pPr>
-      <w:r>
-        <w:rPr/>
-      </w:r>
-    </w:p>
-    <w:p>
-      <w:pPr>
-        <w:pStyle w:val="Normal"/>
-        <w:bidi w:val="0"/>
-        <w:jc w:val="left"/>
+        <w:jc w:val="start"/>
+        <w:rPr/>
+      </w:pPr>
+      <w:r>
+        <w:rPr/>
+      </w:r>
+    </w:p>
+    <w:p>
+      <w:pPr>
+        <w:pStyle w:val="Normal"/>
+        <w:bidi w:val="0"/>
+        <w:jc w:val="start"/>
         <w:rPr/>
       </w:pPr>
       <w:r>
@@ -37,7 +37,7 @@
         <mc:AlternateContent>
           <mc:Choice Requires="wps">
             <w:drawing>
-              <wp:anchor behindDoc="0" distT="635" distB="635" distL="635" distR="635" simplePos="0" locked="0" layoutInCell="0" allowOverlap="1" relativeHeight="2">
+              <wp:anchor distT="635" distB="635" distL="635" distR="635" simplePos="0" relativeHeight="2" behindDoc="0" locked="0" layoutInCell="1" allowOverlap="1">
                 <wp:simplePos x="0" y="0"/>
                 <wp:positionH relativeFrom="column">
                   <wp:posOffset>3810</wp:posOffset>
@@ -63,7 +63,7 @@
                         </a:prstGeom>
                         <a:ln w="0">
                           <a:solidFill>
-                            <a:srgbClr val="3465a4"/>
+                            <a:srgbClr val="3465A4"/>
                           </a:solidFill>
                         </a:ln>
                       </wps:spPr>
@@ -82,7 +82,7 @@
           </mc:Choice>
           <mc:Fallback>
             <w:pict>
-              <v:line id="shape_0" from="0.3pt,5.25pt" to="484.75pt,5.25pt" ID="Horizontal line 1" stroked="t" o:allowincell="f" style="position:absolute">
+              <v:line id="shape_0" from="0.3pt,5.25pt" to="484.75pt,5.25pt" stroked="t" o:allowincell="f" style="position:absolute">
                 <v:stroke color="#3465a4" joinstyle="round" endcap="flat"/>
                 <v:fill o:detectmouseclick="t" on="false"/>
                 <w10:wrap type="none"/>
@@ -119,18 +119,18 @@
       <w:pPr>
         <w:pStyle w:val="Normal"/>
         <w:bidi w:val="0"/>
-        <w:jc w:val="left"/>
-        <w:rPr/>
-      </w:pPr>
-      <w:r>
-        <w:rPr/>
-      </w:r>
-    </w:p>
-    <w:p>
-      <w:pPr>
-        <w:pStyle w:val="Normal"/>
-        <w:bidi w:val="0"/>
-        <w:jc w:val="left"/>
+        <w:jc w:val="start"/>
+        <w:rPr/>
+      </w:pPr>
+      <w:r>
+        <w:rPr/>
+      </w:r>
+    </w:p>
+    <w:p>
+      <w:pPr>
+        <w:pStyle w:val="Normal"/>
+        <w:bidi w:val="0"/>
+        <w:jc w:val="start"/>
         <w:rPr/>
       </w:pPr>
       <w:r>
@@ -142,18 +142,18 @@
       <w:pPr>
         <w:pStyle w:val="Normal"/>
         <w:bidi w:val="0"/>
-        <w:jc w:val="left"/>
-        <w:rPr/>
-      </w:pPr>
-      <w:r>
-        <w:rPr/>
-      </w:r>
-    </w:p>
-    <w:p>
-      <w:pPr>
-        <w:pStyle w:val="Normal"/>
-        <w:bidi w:val="0"/>
-        <w:jc w:val="left"/>
+        <w:jc w:val="start"/>
+        <w:rPr/>
+      </w:pPr>
+      <w:r>
+        <w:rPr/>
+      </w:r>
+    </w:p>
+    <w:p>
+      <w:pPr>
+        <w:pStyle w:val="Normal"/>
+        <w:bidi w:val="0"/>
+        <w:jc w:val="start"/>
         <w:rPr/>
       </w:pPr>
       <w:r>
@@ -165,18 +165,18 @@
       <w:pPr>
         <w:pStyle w:val="Normal"/>
         <w:bidi w:val="0"/>
-        <w:jc w:val="left"/>
-        <w:rPr/>
-      </w:pPr>
-      <w:r>
-        <w:rPr/>
-      </w:r>
-    </w:p>
-    <w:p>
-      <w:pPr>
-        <w:pStyle w:val="Normal"/>
-        <w:bidi w:val="0"/>
-        <w:jc w:val="left"/>
+        <w:jc w:val="start"/>
+        <w:rPr/>
+      </w:pPr>
+      <w:r>
+        <w:rPr/>
+      </w:r>
+    </w:p>
+    <w:p>
+      <w:pPr>
+        <w:pStyle w:val="Normal"/>
+        <w:bidi w:val="0"/>
+        <w:jc w:val="start"/>
         <w:rPr/>
       </w:pPr>
       <w:r>
@@ -199,7 +199,7 @@
       </w:r>
       <w:r>
         <w:drawing>
-          <wp:anchor behindDoc="0" distT="0" distB="0" distL="0" distR="0" simplePos="0" locked="0" layoutInCell="0" allowOverlap="1" relativeHeight="4">
+          <wp:anchor distT="0" distB="0" distL="0" distR="0" simplePos="0" relativeHeight="4" behindDoc="0" locked="0" layoutInCell="0" allowOverlap="1">
             <wp:simplePos x="0" y="0"/>
             <wp:positionH relativeFrom="column">
               <wp:posOffset>2694940</wp:posOffset>
@@ -210,7 +210,7 @@
             <wp:extent cx="3576955" cy="2162810"/>
             <wp:effectExtent l="0" t="0" r="0" b="0"/>
             <wp:wrapSquare wrapText="largest"/>
-            <wp:docPr id="2" name="Image1" descr=""/>
+            <wp:docPr id="2" name="Image1"/>
             <wp:cNvGraphicFramePr>
               <a:graphicFrameLocks xmlns:a="http://schemas.openxmlformats.org/drawingml/2006/main" noChangeAspect="1"/>
             </wp:cNvGraphicFramePr>
@@ -218,7 +218,7 @@
               <a:graphicData uri="http://schemas.openxmlformats.org/drawingml/2006/picture">
                 <pic:pic xmlns:pic="http://schemas.openxmlformats.org/drawingml/2006/picture">
                   <pic:nvPicPr>
-                    <pic:cNvPr id="2" name="Image1" descr=""/>
+                    <pic:cNvPr id="2" name="Image1"/>
                     <pic:cNvPicPr>
                       <a:picLocks noChangeAspect="1" noChangeArrowheads="1"/>
                     </pic:cNvPicPr>
@@ -237,6 +237,7 @@
                     <a:prstGeom prst="rect">
                       <a:avLst/>
                     </a:prstGeom>
+                    <a:noFill/>
                   </pic:spPr>
                 </pic:pic>
               </a:graphicData>
@@ -270,106 +271,106 @@
       <w:pPr>
         <w:pStyle w:val="Normal"/>
         <w:bidi w:val="0"/>
-        <w:jc w:val="left"/>
-        <w:rPr/>
-      </w:pPr>
-      <w:r>
-        <w:rPr/>
-      </w:r>
-    </w:p>
-    <w:p>
-      <w:pPr>
-        <w:pStyle w:val="Normal"/>
-        <w:bidi w:val="0"/>
-        <w:jc w:val="left"/>
-        <w:rPr/>
-      </w:pPr>
-      <w:r>
-        <w:rPr/>
-      </w:r>
-    </w:p>
-    <w:p>
-      <w:pPr>
-        <w:pStyle w:val="Normal"/>
-        <w:bidi w:val="0"/>
-        <w:jc w:val="left"/>
-        <w:rPr/>
-      </w:pPr>
-      <w:r>
-        <w:rPr/>
-      </w:r>
-    </w:p>
-    <w:p>
-      <w:pPr>
-        <w:pStyle w:val="Normal"/>
-        <w:bidi w:val="0"/>
-        <w:jc w:val="left"/>
-        <w:rPr/>
-      </w:pPr>
-      <w:r>
-        <w:rPr/>
-      </w:r>
-    </w:p>
-    <w:p>
-      <w:pPr>
-        <w:pStyle w:val="Normal"/>
-        <w:bidi w:val="0"/>
-        <w:jc w:val="left"/>
-        <w:rPr/>
-      </w:pPr>
-      <w:r>
-        <w:rPr/>
-      </w:r>
-    </w:p>
-    <w:p>
-      <w:pPr>
-        <w:pStyle w:val="Normal"/>
-        <w:bidi w:val="0"/>
-        <w:jc w:val="left"/>
-        <w:rPr/>
-      </w:pPr>
-      <w:r>
-        <w:rPr/>
-      </w:r>
-    </w:p>
-    <w:p>
-      <w:pPr>
-        <w:pStyle w:val="Normal"/>
-        <w:bidi w:val="0"/>
-        <w:jc w:val="left"/>
-        <w:rPr/>
-      </w:pPr>
-      <w:r>
-        <w:rPr/>
-      </w:r>
-    </w:p>
-    <w:p>
-      <w:pPr>
-        <w:pStyle w:val="Normal"/>
-        <w:bidi w:val="0"/>
-        <w:jc w:val="left"/>
-        <w:rPr/>
-      </w:pPr>
-      <w:r>
-        <w:rPr/>
-      </w:r>
-    </w:p>
-    <w:p>
-      <w:pPr>
-        <w:pStyle w:val="Normal"/>
-        <w:bidi w:val="0"/>
-        <w:jc w:val="left"/>
-        <w:rPr/>
-      </w:pPr>
-      <w:r>
-        <w:rPr/>
-      </w:r>
-    </w:p>
-    <w:p>
-      <w:pPr>
-        <w:pStyle w:val="Normal"/>
-        <w:bidi w:val="0"/>
-        <w:jc w:val="left"/>
+        <w:jc w:val="start"/>
+        <w:rPr/>
+      </w:pPr>
+      <w:r>
+        <w:rPr/>
+      </w:r>
+    </w:p>
+    <w:p>
+      <w:pPr>
+        <w:pStyle w:val="Normal"/>
+        <w:bidi w:val="0"/>
+        <w:jc w:val="start"/>
+        <w:rPr/>
+      </w:pPr>
+      <w:r>
+        <w:rPr/>
+      </w:r>
+    </w:p>
+    <w:p>
+      <w:pPr>
+        <w:pStyle w:val="Normal"/>
+        <w:bidi w:val="0"/>
+        <w:jc w:val="start"/>
+        <w:rPr/>
+      </w:pPr>
+      <w:r>
+        <w:rPr/>
+      </w:r>
+    </w:p>
+    <w:p>
+      <w:pPr>
+        <w:pStyle w:val="Normal"/>
+        <w:bidi w:val="0"/>
+        <w:jc w:val="start"/>
+        <w:rPr/>
+      </w:pPr>
+      <w:r>
+        <w:rPr/>
+      </w:r>
+    </w:p>
+    <w:p>
+      <w:pPr>
+        <w:pStyle w:val="Normal"/>
+        <w:bidi w:val="0"/>
+        <w:jc w:val="start"/>
+        <w:rPr/>
+      </w:pPr>
+      <w:r>
+        <w:rPr/>
+      </w:r>
+    </w:p>
+    <w:p>
+      <w:pPr>
+        <w:pStyle w:val="Normal"/>
+        <w:bidi w:val="0"/>
+        <w:jc w:val="start"/>
+        <w:rPr/>
+      </w:pPr>
+      <w:r>
+        <w:rPr/>
+      </w:r>
+    </w:p>
+    <w:p>
+      <w:pPr>
+        <w:pStyle w:val="Normal"/>
+        <w:bidi w:val="0"/>
+        <w:jc w:val="start"/>
+        <w:rPr/>
+      </w:pPr>
+      <w:r>
+        <w:rPr/>
+      </w:r>
+    </w:p>
+    <w:p>
+      <w:pPr>
+        <w:pStyle w:val="Normal"/>
+        <w:bidi w:val="0"/>
+        <w:jc w:val="start"/>
+        <w:rPr/>
+      </w:pPr>
+      <w:r>
+        <w:rPr/>
+      </w:r>
+    </w:p>
+    <w:p>
+      <w:pPr>
+        <w:pStyle w:val="Normal"/>
+        <w:bidi w:val="0"/>
+        <w:jc w:val="start"/>
+        <w:rPr/>
+      </w:pPr>
+      <w:r>
+        <w:rPr/>
+      </w:r>
+    </w:p>
+    <w:p>
+      <w:pPr>
+        <w:pStyle w:val="Normal"/>
+        <w:bidi w:val="0"/>
+        <w:jc w:val="start"/>
         <w:rPr/>
       </w:pPr>
       <w:r>
@@ -452,6 +453,7 @@
       <w:pPr>
         <w:pStyle w:val="Normal"/>
         <w:bidi w:val="0"/>
+        <w:spacing w:before="0" w:after="0"/>
         <w:jc w:val="both"/>
         <w:rPr/>
       </w:pPr>
@@ -481,7 +483,7 @@
       <w:r>
         <w:rPr/>
         <w:drawing>
-          <wp:anchor behindDoc="0" distT="0" distB="0" distL="0" distR="0" simplePos="0" locked="0" layoutInCell="0" allowOverlap="1" relativeHeight="5">
+          <wp:anchor distT="0" distB="0" distL="0" distR="0" simplePos="0" relativeHeight="5" behindDoc="0" locked="0" layoutInCell="0" allowOverlap="1">
             <wp:simplePos x="0" y="0"/>
             <wp:positionH relativeFrom="column">
               <wp:align>center</wp:align>
@@ -492,7 +494,7 @@
             <wp:extent cx="6332220" cy="3229610"/>
             <wp:effectExtent l="0" t="0" r="0" b="0"/>
             <wp:wrapSquare wrapText="largest"/>
-            <wp:docPr id="3" name="Image2" descr=""/>
+            <wp:docPr id="3" name="Image2"/>
             <wp:cNvGraphicFramePr>
               <a:graphicFrameLocks xmlns:a="http://schemas.openxmlformats.org/drawingml/2006/main" noChangeAspect="1"/>
             </wp:cNvGraphicFramePr>
@@ -500,7 +502,7 @@
               <a:graphicData uri="http://schemas.openxmlformats.org/drawingml/2006/picture">
                 <pic:pic xmlns:pic="http://schemas.openxmlformats.org/drawingml/2006/picture">
                   <pic:nvPicPr>
-                    <pic:cNvPr id="3" name="Image2" descr=""/>
+                    <pic:cNvPr id="3" name="Image2"/>
                     <pic:cNvPicPr>
                       <a:picLocks noChangeAspect="1" noChangeArrowheads="1"/>
                     </pic:cNvPicPr>
@@ -519,6 +521,7 @@
                     <a:prstGeom prst="rect">
                       <a:avLst/>
                     </a:prstGeom>
+                    <a:noFill/>
                   </pic:spPr>
                 </pic:pic>
               </a:graphicData>
@@ -758,7 +761,6 @@
         <w:jc w:val="both"/>
         <w:rPr>
           <w:i w:val="false"/>
-          <w:i w:val="false"/>
           <w:iCs w:val="false"/>
         </w:rPr>
       </w:pPr>
@@ -792,18 +794,18 @@
       <w:pPr>
         <w:pStyle w:val="Normal"/>
         <w:bidi w:val="0"/>
-        <w:jc w:val="left"/>
-        <w:rPr/>
-      </w:pPr>
-      <w:r>
-        <w:rPr/>
-      </w:r>
-    </w:p>
-    <w:p>
-      <w:pPr>
-        <w:pStyle w:val="Normal"/>
-        <w:bidi w:val="0"/>
-        <w:jc w:val="left"/>
+        <w:jc w:val="start"/>
+        <w:rPr/>
+      </w:pPr>
+      <w:r>
+        <w:rPr/>
+      </w:r>
+    </w:p>
+    <w:p>
+      <w:pPr>
+        <w:pStyle w:val="Normal"/>
+        <w:bidi w:val="0"/>
+        <w:jc w:val="start"/>
         <w:rPr/>
       </w:pPr>
       <w:r>
@@ -811,7 +813,7 @@
         <mc:AlternateContent>
           <mc:Choice Requires="wps">
             <w:drawing>
-              <wp:anchor behindDoc="0" distT="635" distB="635" distL="635" distR="635" simplePos="0" locked="0" layoutInCell="0" allowOverlap="1" relativeHeight="3">
+              <wp:anchor distT="635" distB="635" distL="635" distR="635" simplePos="0" relativeHeight="3" behindDoc="0" locked="0" layoutInCell="1" allowOverlap="1">
                 <wp:simplePos x="0" y="0"/>
                 <wp:positionH relativeFrom="column">
                   <wp:posOffset>3810</wp:posOffset>
@@ -837,7 +839,7 @@
                         </a:prstGeom>
                         <a:ln w="0">
                           <a:solidFill>
-                            <a:srgbClr val="3465a4"/>
+                            <a:srgbClr val="3465A4"/>
                           </a:solidFill>
                         </a:ln>
                       </wps:spPr>
@@ -856,7 +858,7 @@
           </mc:Choice>
           <mc:Fallback>
             <w:pict>
-              <v:line id="shape_0" from="0.3pt,5.25pt" to="484.75pt,5.25pt" ID="Horizontal line 2" stroked="t" o:allowincell="f" style="position:absolute">
+              <v:line id="shape_0" from="0.3pt,5.25pt" to="484.75pt,5.25pt" stroked="t" o:allowincell="f" style="position:absolute">
                 <v:stroke color="#3465a4" joinstyle="round" endcap="flat"/>
                 <v:fill o:detectmouseclick="t" on="false"/>
                 <w10:wrap type="none"/>
@@ -870,7 +872,7 @@
       <w:pPr>
         <w:pStyle w:val="Normal"/>
         <w:bidi w:val="0"/>
-        <w:jc w:val="left"/>
+        <w:jc w:val="start"/>
         <w:rPr/>
       </w:pPr>
       <w:r>
@@ -885,7 +887,8 @@
       <w:pPr>
         <w:pStyle w:val="Normal"/>
         <w:bidi w:val="0"/>
-        <w:jc w:val="left"/>
+        <w:spacing w:before="0" w:after="0"/>
+        <w:jc w:val="start"/>
         <w:rPr/>
       </w:pPr>
       <w:r>
@@ -897,18 +900,18 @@
       <w:pPr>
         <w:pStyle w:val="Normal"/>
         <w:bidi w:val="0"/>
-        <w:jc w:val="left"/>
-        <w:rPr/>
-      </w:pPr>
-      <w:r>
-        <w:rPr/>
-      </w:r>
-    </w:p>
-    <w:p>
-      <w:pPr>
-        <w:pStyle w:val="Normal"/>
-        <w:bidi w:val="0"/>
-        <w:jc w:val="left"/>
+        <w:jc w:val="start"/>
+        <w:rPr/>
+      </w:pPr>
+      <w:r>
+        <w:rPr/>
+      </w:r>
+    </w:p>
+    <w:p>
+      <w:pPr>
+        <w:pStyle w:val="Normal"/>
+        <w:bidi w:val="0"/>
+        <w:jc w:val="start"/>
         <w:rPr/>
       </w:pPr>
       <w:r>
@@ -920,18 +923,18 @@
       <w:pPr>
         <w:pStyle w:val="Normal"/>
         <w:bidi w:val="0"/>
-        <w:jc w:val="left"/>
-        <w:rPr/>
-      </w:pPr>
-      <w:r>
-        <w:rPr/>
-      </w:r>
-    </w:p>
-    <w:p>
-      <w:pPr>
-        <w:pStyle w:val="Normal"/>
-        <w:bidi w:val="0"/>
-        <w:jc w:val="left"/>
+        <w:jc w:val="start"/>
+        <w:rPr/>
+      </w:pPr>
+      <w:r>
+        <w:rPr/>
+      </w:r>
+    </w:p>
+    <w:p>
+      <w:pPr>
+        <w:pStyle w:val="Normal"/>
+        <w:bidi w:val="0"/>
+        <w:jc w:val="start"/>
         <w:rPr/>
       </w:pPr>
       <w:r>
@@ -943,7 +946,7 @@
       <w:pPr>
         <w:pStyle w:val="Normal"/>
         <w:bidi w:val="0"/>
-        <w:jc w:val="left"/>
+        <w:jc w:val="start"/>
         <w:rPr/>
       </w:pPr>
       <w:r>
@@ -953,21 +956,21 @@
     <w:tbl>
       <w:tblPr>
         <w:tblW w:w="5000" w:type="pct"/>
-        <w:jc w:val="left"/>
+        <w:jc w:val="start"/>
         <w:tblInd w:w="-5" w:type="dxa"/>
         <w:tblLayout w:type="fixed"/>
         <w:tblCellMar>
           <w:top w:w="55" w:type="dxa"/>
-          <w:left w:w="55" w:type="dxa"/>
+          <w:start w:w="55" w:type="dxa"/>
           <w:bottom w:w="55" w:type="dxa"/>
-          <w:right w:w="55" w:type="dxa"/>
+          <w:end w:w="55" w:type="dxa"/>
         </w:tblCellMar>
       </w:tblPr>
       <w:tblGrid>
         <w:gridCol w:w="2771"/>
         <w:gridCol w:w="2772"/>
         <w:gridCol w:w="2772"/>
-        <w:gridCol w:w="2772"/>
+        <w:gridCol w:w="2773"/>
       </w:tblGrid>
       <w:tr>
         <w:trPr/>
@@ -976,7 +979,7 @@
             <w:tcW w:w="2771" w:type="dxa"/>
             <w:tcBorders>
               <w:top w:val="single" w:sz="4" w:space="0" w:color="000000"/>
-              <w:left w:val="single" w:sz="4" w:space="0" w:color="000000"/>
+              <w:start w:val="single" w:sz="4" w:space="0" w:color="000000"/>
               <w:bottom w:val="single" w:sz="4" w:space="0" w:color="000000"/>
             </w:tcBorders>
           </w:tcPr>
@@ -999,7 +1002,7 @@
             <w:tcW w:w="2772" w:type="dxa"/>
             <w:tcBorders>
               <w:top w:val="single" w:sz="4" w:space="0" w:color="000000"/>
-              <w:left w:val="single" w:sz="4" w:space="0" w:color="000000"/>
+              <w:start w:val="single" w:sz="4" w:space="0" w:color="000000"/>
               <w:bottom w:val="single" w:sz="4" w:space="0" w:color="000000"/>
             </w:tcBorders>
           </w:tcPr>
@@ -1022,7 +1025,7 @@
             <w:tcW w:w="2772" w:type="dxa"/>
             <w:tcBorders>
               <w:top w:val="single" w:sz="4" w:space="0" w:color="000000"/>
-              <w:left w:val="single" w:sz="4" w:space="0" w:color="000000"/>
+              <w:start w:val="single" w:sz="4" w:space="0" w:color="000000"/>
               <w:bottom w:val="single" w:sz="4" w:space="0" w:color="000000"/>
             </w:tcBorders>
           </w:tcPr>
@@ -1042,12 +1045,12 @@
         </w:tc>
         <w:tc>
           <w:tcPr>
-            <w:tcW w:w="2772" w:type="dxa"/>
+            <w:tcW w:w="2773" w:type="dxa"/>
             <w:tcBorders>
               <w:top w:val="single" w:sz="4" w:space="0" w:color="000000"/>
-              <w:left w:val="single" w:sz="4" w:space="0" w:color="000000"/>
-              <w:bottom w:val="single" w:sz="4" w:space="0" w:color="000000"/>
-              <w:right w:val="single" w:sz="4" w:space="0" w:color="000000"/>
+              <w:start w:val="single" w:sz="4" w:space="0" w:color="000000"/>
+              <w:bottom w:val="single" w:sz="4" w:space="0" w:color="000000"/>
+              <w:end w:val="single" w:sz="4" w:space="0" w:color="000000"/>
             </w:tcBorders>
           </w:tcPr>
           <w:p>
@@ -1074,7 +1077,7 @@
             <w:tcW w:w="2771" w:type="dxa"/>
             <w:vMerge w:val="restart"/>
             <w:tcBorders>
-              <w:left w:val="single" w:sz="4" w:space="0" w:color="000000"/>
+              <w:start w:val="single" w:sz="4" w:space="0" w:color="000000"/>
               <w:bottom w:val="single" w:sz="4" w:space="0" w:color="000000"/>
             </w:tcBorders>
             <w:vAlign w:val="center"/>
@@ -1098,7 +1101,7 @@
             <w:tcW w:w="2772" w:type="dxa"/>
             <w:vMerge w:val="restart"/>
             <w:tcBorders>
-              <w:left w:val="single" w:sz="4" w:space="0" w:color="000000"/>
+              <w:start w:val="single" w:sz="4" w:space="0" w:color="000000"/>
               <w:bottom w:val="single" w:sz="4" w:space="0" w:color="000000"/>
             </w:tcBorders>
             <w:vAlign w:val="center"/>
@@ -1139,7 +1142,7 @@
           <w:tcPr>
             <w:tcW w:w="2772" w:type="dxa"/>
             <w:tcBorders>
-              <w:left w:val="single" w:sz="4" w:space="0" w:color="000000"/>
+              <w:start w:val="single" w:sz="4" w:space="0" w:color="000000"/>
               <w:bottom w:val="single" w:sz="4" w:space="0" w:color="000000"/>
             </w:tcBorders>
             <w:vAlign w:val="center"/>
@@ -1160,19 +1163,19 @@
         </w:tc>
         <w:tc>
           <w:tcPr>
-            <w:tcW w:w="2772" w:type="dxa"/>
-            <w:tcBorders>
-              <w:left w:val="single" w:sz="4" w:space="0" w:color="000000"/>
-              <w:bottom w:val="single" w:sz="4" w:space="0" w:color="000000"/>
-              <w:right w:val="single" w:sz="4" w:space="0" w:color="000000"/>
-            </w:tcBorders>
-          </w:tcPr>
-          <w:p>
-            <w:pPr>
-              <w:pStyle w:val="TableContents"/>
-              <w:widowControl w:val="false"/>
-              <w:bidi w:val="0"/>
-              <w:jc w:val="left"/>
+            <w:tcW w:w="2773" w:type="dxa"/>
+            <w:tcBorders>
+              <w:start w:val="single" w:sz="4" w:space="0" w:color="000000"/>
+              <w:bottom w:val="single" w:sz="4" w:space="0" w:color="000000"/>
+              <w:end w:val="single" w:sz="4" w:space="0" w:color="000000"/>
+            </w:tcBorders>
+          </w:tcPr>
+          <w:p>
+            <w:pPr>
+              <w:pStyle w:val="TableContents"/>
+              <w:widowControl w:val="false"/>
+              <w:bidi w:val="0"/>
+              <w:jc w:val="start"/>
               <w:rPr/>
             </w:pPr>
             <w:r>
@@ -1185,7 +1188,7 @@
               <w:pStyle w:val="TableContents"/>
               <w:widowControl w:val="false"/>
               <w:bidi w:val="0"/>
-              <w:jc w:val="left"/>
+              <w:jc w:val="start"/>
               <w:rPr/>
             </w:pPr>
             <w:r>
@@ -1198,7 +1201,7 @@
               <w:pStyle w:val="TableContents"/>
               <w:widowControl w:val="false"/>
               <w:bidi w:val="0"/>
-              <w:jc w:val="left"/>
+              <w:jc w:val="start"/>
               <w:rPr/>
             </w:pPr>
             <w:r>
@@ -1211,7 +1214,7 @@
               <w:pStyle w:val="TableContents"/>
               <w:widowControl w:val="false"/>
               <w:bidi w:val="0"/>
-              <w:jc w:val="left"/>
+              <w:jc w:val="start"/>
               <w:rPr/>
             </w:pPr>
             <w:r>
@@ -1224,7 +1227,7 @@
               <w:pStyle w:val="TableContents"/>
               <w:widowControl w:val="false"/>
               <w:bidi w:val="0"/>
-              <w:jc w:val="left"/>
+              <w:jc w:val="start"/>
               <w:rPr/>
             </w:pPr>
             <w:r>
@@ -1237,7 +1240,7 @@
               <w:pStyle w:val="TableContents"/>
               <w:widowControl w:val="false"/>
               <w:bidi w:val="0"/>
-              <w:jc w:val="left"/>
+              <w:jc w:val="start"/>
               <w:rPr/>
             </w:pPr>
             <w:r>
@@ -1250,7 +1253,7 @@
               <w:pStyle w:val="TableContents"/>
               <w:widowControl w:val="false"/>
               <w:bidi w:val="0"/>
-              <w:jc w:val="left"/>
+              <w:jc w:val="start"/>
               <w:rPr/>
             </w:pPr>
             <w:r>
@@ -1269,7 +1272,7 @@
             <w:tcW w:w="2771" w:type="dxa"/>
             <w:vMerge w:val="continue"/>
             <w:tcBorders>
-              <w:left w:val="single" w:sz="4" w:space="0" w:color="000000"/>
+              <w:start w:val="single" w:sz="4" w:space="0" w:color="000000"/>
               <w:bottom w:val="single" w:sz="4" w:space="0" w:color="000000"/>
             </w:tcBorders>
             <w:vAlign w:val="center"/>
@@ -1292,7 +1295,7 @@
             <w:tcW w:w="2772" w:type="dxa"/>
             <w:vMerge w:val="continue"/>
             <w:tcBorders>
-              <w:left w:val="single" w:sz="4" w:space="0" w:color="000000"/>
+              <w:start w:val="single" w:sz="4" w:space="0" w:color="000000"/>
               <w:bottom w:val="single" w:sz="4" w:space="0" w:color="000000"/>
             </w:tcBorders>
             <w:vAlign w:val="center"/>
@@ -1314,7 +1317,7 @@
           <w:tcPr>
             <w:tcW w:w="2772" w:type="dxa"/>
             <w:tcBorders>
-              <w:left w:val="single" w:sz="4" w:space="0" w:color="000000"/>
+              <w:start w:val="single" w:sz="4" w:space="0" w:color="000000"/>
               <w:bottom w:val="single" w:sz="4" w:space="0" w:color="000000"/>
             </w:tcBorders>
             <w:vAlign w:val="center"/>
@@ -1335,19 +1338,19 @@
         </w:tc>
         <w:tc>
           <w:tcPr>
-            <w:tcW w:w="2772" w:type="dxa"/>
-            <w:tcBorders>
-              <w:left w:val="single" w:sz="4" w:space="0" w:color="000000"/>
-              <w:bottom w:val="single" w:sz="4" w:space="0" w:color="000000"/>
-              <w:right w:val="single" w:sz="4" w:space="0" w:color="000000"/>
-            </w:tcBorders>
-          </w:tcPr>
-          <w:p>
-            <w:pPr>
-              <w:pStyle w:val="TableContents"/>
-              <w:widowControl w:val="false"/>
-              <w:bidi w:val="0"/>
-              <w:jc w:val="left"/>
+            <w:tcW w:w="2773" w:type="dxa"/>
+            <w:tcBorders>
+              <w:start w:val="single" w:sz="4" w:space="0" w:color="000000"/>
+              <w:bottom w:val="single" w:sz="4" w:space="0" w:color="000000"/>
+              <w:end w:val="single" w:sz="4" w:space="0" w:color="000000"/>
+            </w:tcBorders>
+          </w:tcPr>
+          <w:p>
+            <w:pPr>
+              <w:pStyle w:val="TableContents"/>
+              <w:widowControl w:val="false"/>
+              <w:bidi w:val="0"/>
+              <w:jc w:val="start"/>
               <w:rPr/>
             </w:pPr>
             <w:r>
@@ -1360,7 +1363,7 @@
               <w:pStyle w:val="TableContents"/>
               <w:widowControl w:val="false"/>
               <w:bidi w:val="0"/>
-              <w:jc w:val="left"/>
+              <w:jc w:val="start"/>
               <w:rPr/>
             </w:pPr>
             <w:r>
@@ -1373,7 +1376,7 @@
               <w:pStyle w:val="TableContents"/>
               <w:widowControl w:val="false"/>
               <w:bidi w:val="0"/>
-              <w:jc w:val="left"/>
+              <w:jc w:val="start"/>
               <w:rPr/>
             </w:pPr>
             <w:r>
@@ -1386,7 +1389,7 @@
               <w:pStyle w:val="TableContents"/>
               <w:widowControl w:val="false"/>
               <w:bidi w:val="0"/>
-              <w:jc w:val="left"/>
+              <w:jc w:val="start"/>
               <w:rPr/>
             </w:pPr>
             <w:r>
@@ -1399,7 +1402,7 @@
               <w:pStyle w:val="TableContents"/>
               <w:widowControl w:val="false"/>
               <w:bidi w:val="0"/>
-              <w:jc w:val="left"/>
+              <w:jc w:val="start"/>
               <w:rPr/>
             </w:pPr>
             <w:r>
@@ -1415,7 +1418,7 @@
           <w:tcPr>
             <w:tcW w:w="2771" w:type="dxa"/>
             <w:tcBorders>
-              <w:left w:val="single" w:sz="4" w:space="0" w:color="000000"/>
+              <w:start w:val="single" w:sz="4" w:space="0" w:color="000000"/>
               <w:bottom w:val="single" w:sz="4" w:space="0" w:color="000000"/>
             </w:tcBorders>
             <w:vAlign w:val="center"/>
@@ -1438,7 +1441,7 @@
           <w:tcPr>
             <w:tcW w:w="2772" w:type="dxa"/>
             <w:tcBorders>
-              <w:left w:val="single" w:sz="4" w:space="0" w:color="000000"/>
+              <w:start w:val="single" w:sz="4" w:space="0" w:color="000000"/>
               <w:bottom w:val="single" w:sz="4" w:space="0" w:color="000000"/>
             </w:tcBorders>
             <w:vAlign w:val="center"/>
@@ -1479,7 +1482,7 @@
           <w:tcPr>
             <w:tcW w:w="2772" w:type="dxa"/>
             <w:tcBorders>
-              <w:left w:val="single" w:sz="4" w:space="0" w:color="000000"/>
+              <w:start w:val="single" w:sz="4" w:space="0" w:color="000000"/>
               <w:bottom w:val="single" w:sz="4" w:space="0" w:color="000000"/>
             </w:tcBorders>
             <w:vAlign w:val="center"/>
@@ -1500,19 +1503,19 @@
         </w:tc>
         <w:tc>
           <w:tcPr>
-            <w:tcW w:w="2772" w:type="dxa"/>
-            <w:tcBorders>
-              <w:left w:val="single" w:sz="4" w:space="0" w:color="000000"/>
-              <w:bottom w:val="single" w:sz="4" w:space="0" w:color="000000"/>
-              <w:right w:val="single" w:sz="4" w:space="0" w:color="000000"/>
-            </w:tcBorders>
-          </w:tcPr>
-          <w:p>
-            <w:pPr>
-              <w:pStyle w:val="TableContents"/>
-              <w:widowControl w:val="false"/>
-              <w:bidi w:val="0"/>
-              <w:jc w:val="left"/>
+            <w:tcW w:w="2773" w:type="dxa"/>
+            <w:tcBorders>
+              <w:start w:val="single" w:sz="4" w:space="0" w:color="000000"/>
+              <w:bottom w:val="single" w:sz="4" w:space="0" w:color="000000"/>
+              <w:end w:val="single" w:sz="4" w:space="0" w:color="000000"/>
+            </w:tcBorders>
+          </w:tcPr>
+          <w:p>
+            <w:pPr>
+              <w:pStyle w:val="TableContents"/>
+              <w:widowControl w:val="false"/>
+              <w:bidi w:val="0"/>
+              <w:jc w:val="start"/>
               <w:rPr/>
             </w:pPr>
             <w:r>
@@ -1525,7 +1528,7 @@
               <w:pStyle w:val="TableContents"/>
               <w:widowControl w:val="false"/>
               <w:bidi w:val="0"/>
-              <w:jc w:val="left"/>
+              <w:jc w:val="start"/>
               <w:rPr/>
             </w:pPr>
             <w:r>
@@ -1544,7 +1547,7 @@
             <w:tcW w:w="2771" w:type="dxa"/>
             <w:vMerge w:val="restart"/>
             <w:tcBorders>
-              <w:left w:val="single" w:sz="4" w:space="0" w:color="000000"/>
+              <w:start w:val="single" w:sz="4" w:space="0" w:color="000000"/>
               <w:bottom w:val="single" w:sz="4" w:space="0" w:color="000000"/>
             </w:tcBorders>
             <w:vAlign w:val="center"/>
@@ -1568,7 +1571,7 @@
             <w:tcW w:w="2772" w:type="dxa"/>
             <w:vMerge w:val="restart"/>
             <w:tcBorders>
-              <w:left w:val="single" w:sz="4" w:space="0" w:color="000000"/>
+              <w:start w:val="single" w:sz="4" w:space="0" w:color="000000"/>
               <w:bottom w:val="single" w:sz="4" w:space="0" w:color="000000"/>
             </w:tcBorders>
             <w:vAlign w:val="center"/>
@@ -1609,7 +1612,7 @@
           <w:tcPr>
             <w:tcW w:w="2772" w:type="dxa"/>
             <w:tcBorders>
-              <w:left w:val="single" w:sz="4" w:space="0" w:color="000000"/>
+              <w:start w:val="single" w:sz="4" w:space="0" w:color="000000"/>
               <w:bottom w:val="single" w:sz="4" w:space="0" w:color="000000"/>
             </w:tcBorders>
             <w:vAlign w:val="center"/>
@@ -1630,19 +1633,19 @@
         </w:tc>
         <w:tc>
           <w:tcPr>
-            <w:tcW w:w="2772" w:type="dxa"/>
-            <w:tcBorders>
-              <w:left w:val="single" w:sz="4" w:space="0" w:color="000000"/>
-              <w:bottom w:val="single" w:sz="4" w:space="0" w:color="000000"/>
-              <w:right w:val="single" w:sz="4" w:space="0" w:color="000000"/>
-            </w:tcBorders>
-          </w:tcPr>
-          <w:p>
-            <w:pPr>
-              <w:pStyle w:val="TableContents"/>
-              <w:widowControl w:val="false"/>
-              <w:bidi w:val="0"/>
-              <w:jc w:val="left"/>
+            <w:tcW w:w="2773" w:type="dxa"/>
+            <w:tcBorders>
+              <w:start w:val="single" w:sz="4" w:space="0" w:color="000000"/>
+              <w:bottom w:val="single" w:sz="4" w:space="0" w:color="000000"/>
+              <w:end w:val="single" w:sz="4" w:space="0" w:color="000000"/>
+            </w:tcBorders>
+          </w:tcPr>
+          <w:p>
+            <w:pPr>
+              <w:pStyle w:val="TableContents"/>
+              <w:widowControl w:val="false"/>
+              <w:bidi w:val="0"/>
+              <w:jc w:val="start"/>
               <w:rPr/>
             </w:pPr>
             <w:r>
@@ -1661,7 +1664,7 @@
             <w:tcW w:w="2771" w:type="dxa"/>
             <w:vMerge w:val="continue"/>
             <w:tcBorders>
-              <w:left w:val="single" w:sz="4" w:space="0" w:color="000000"/>
+              <w:start w:val="single" w:sz="4" w:space="0" w:color="000000"/>
               <w:bottom w:val="single" w:sz="4" w:space="0" w:color="000000"/>
             </w:tcBorders>
             <w:vAlign w:val="center"/>
@@ -1684,7 +1687,7 @@
             <w:tcW w:w="2772" w:type="dxa"/>
             <w:vMerge w:val="continue"/>
             <w:tcBorders>
-              <w:left w:val="single" w:sz="4" w:space="0" w:color="000000"/>
+              <w:start w:val="single" w:sz="4" w:space="0" w:color="000000"/>
               <w:bottom w:val="single" w:sz="4" w:space="0" w:color="000000"/>
             </w:tcBorders>
             <w:vAlign w:val="center"/>
@@ -1706,7 +1709,7 @@
           <w:tcPr>
             <w:tcW w:w="2772" w:type="dxa"/>
             <w:tcBorders>
-              <w:left w:val="single" w:sz="4" w:space="0" w:color="000000"/>
+              <w:start w:val="single" w:sz="4" w:space="0" w:color="000000"/>
               <w:bottom w:val="single" w:sz="4" w:space="0" w:color="000000"/>
             </w:tcBorders>
             <w:vAlign w:val="center"/>
@@ -1727,19 +1730,19 @@
         </w:tc>
         <w:tc>
           <w:tcPr>
-            <w:tcW w:w="2772" w:type="dxa"/>
-            <w:tcBorders>
-              <w:left w:val="single" w:sz="4" w:space="0" w:color="000000"/>
-              <w:bottom w:val="single" w:sz="4" w:space="0" w:color="000000"/>
-              <w:right w:val="single" w:sz="4" w:space="0" w:color="000000"/>
-            </w:tcBorders>
-          </w:tcPr>
-          <w:p>
-            <w:pPr>
-              <w:pStyle w:val="TableContents"/>
-              <w:widowControl w:val="false"/>
-              <w:bidi w:val="0"/>
-              <w:jc w:val="left"/>
+            <w:tcW w:w="2773" w:type="dxa"/>
+            <w:tcBorders>
+              <w:start w:val="single" w:sz="4" w:space="0" w:color="000000"/>
+              <w:bottom w:val="single" w:sz="4" w:space="0" w:color="000000"/>
+              <w:end w:val="single" w:sz="4" w:space="0" w:color="000000"/>
+            </w:tcBorders>
+          </w:tcPr>
+          <w:p>
+            <w:pPr>
+              <w:pStyle w:val="TableContents"/>
+              <w:widowControl w:val="false"/>
+              <w:bidi w:val="0"/>
+              <w:jc w:val="start"/>
               <w:rPr/>
             </w:pPr>
             <w:r>
@@ -1758,7 +1761,7 @@
             <w:tcW w:w="2771" w:type="dxa"/>
             <w:vMerge w:val="continue"/>
             <w:tcBorders>
-              <w:left w:val="single" w:sz="4" w:space="0" w:color="000000"/>
+              <w:start w:val="single" w:sz="4" w:space="0" w:color="000000"/>
               <w:bottom w:val="single" w:sz="4" w:space="0" w:color="000000"/>
             </w:tcBorders>
             <w:vAlign w:val="center"/>
@@ -1781,7 +1784,7 @@
             <w:tcW w:w="2772" w:type="dxa"/>
             <w:vMerge w:val="continue"/>
             <w:tcBorders>
-              <w:left w:val="single" w:sz="4" w:space="0" w:color="000000"/>
+              <w:start w:val="single" w:sz="4" w:space="0" w:color="000000"/>
               <w:bottom w:val="single" w:sz="4" w:space="0" w:color="000000"/>
             </w:tcBorders>
             <w:vAlign w:val="center"/>
@@ -1803,7 +1806,7 @@
           <w:tcPr>
             <w:tcW w:w="2772" w:type="dxa"/>
             <w:tcBorders>
-              <w:left w:val="single" w:sz="4" w:space="0" w:color="000000"/>
+              <w:start w:val="single" w:sz="4" w:space="0" w:color="000000"/>
               <w:bottom w:val="single" w:sz="4" w:space="0" w:color="000000"/>
             </w:tcBorders>
             <w:vAlign w:val="center"/>
@@ -1824,19 +1827,19 @@
         </w:tc>
         <w:tc>
           <w:tcPr>
-            <w:tcW w:w="2772" w:type="dxa"/>
-            <w:tcBorders>
-              <w:left w:val="single" w:sz="4" w:space="0" w:color="000000"/>
-              <w:bottom w:val="single" w:sz="4" w:space="0" w:color="000000"/>
-              <w:right w:val="single" w:sz="4" w:space="0" w:color="000000"/>
-            </w:tcBorders>
-          </w:tcPr>
-          <w:p>
-            <w:pPr>
-              <w:pStyle w:val="TableContents"/>
-              <w:widowControl w:val="false"/>
-              <w:bidi w:val="0"/>
-              <w:jc w:val="left"/>
+            <w:tcW w:w="2773" w:type="dxa"/>
+            <w:tcBorders>
+              <w:start w:val="single" w:sz="4" w:space="0" w:color="000000"/>
+              <w:bottom w:val="single" w:sz="4" w:space="0" w:color="000000"/>
+              <w:end w:val="single" w:sz="4" w:space="0" w:color="000000"/>
+            </w:tcBorders>
+          </w:tcPr>
+          <w:p>
+            <w:pPr>
+              <w:pStyle w:val="TableContents"/>
+              <w:widowControl w:val="false"/>
+              <w:bidi w:val="0"/>
+              <w:jc w:val="start"/>
               <w:rPr/>
             </w:pPr>
             <w:r>
@@ -1855,7 +1858,7 @@
             <w:tcW w:w="2771" w:type="dxa"/>
             <w:vMerge w:val="continue"/>
             <w:tcBorders>
-              <w:left w:val="single" w:sz="4" w:space="0" w:color="000000"/>
+              <w:start w:val="single" w:sz="4" w:space="0" w:color="000000"/>
               <w:bottom w:val="single" w:sz="4" w:space="0" w:color="000000"/>
             </w:tcBorders>
             <w:vAlign w:val="center"/>
@@ -1878,7 +1881,7 @@
             <w:tcW w:w="2772" w:type="dxa"/>
             <w:vMerge w:val="continue"/>
             <w:tcBorders>
-              <w:left w:val="single" w:sz="4" w:space="0" w:color="000000"/>
+              <w:start w:val="single" w:sz="4" w:space="0" w:color="000000"/>
               <w:bottom w:val="single" w:sz="4" w:space="0" w:color="000000"/>
             </w:tcBorders>
             <w:vAlign w:val="center"/>
@@ -1900,7 +1903,7 @@
           <w:tcPr>
             <w:tcW w:w="2772" w:type="dxa"/>
             <w:tcBorders>
-              <w:left w:val="single" w:sz="4" w:space="0" w:color="000000"/>
+              <w:start w:val="single" w:sz="4" w:space="0" w:color="000000"/>
               <w:bottom w:val="single" w:sz="4" w:space="0" w:color="000000"/>
             </w:tcBorders>
             <w:vAlign w:val="center"/>
@@ -1921,19 +1924,19 @@
         </w:tc>
         <w:tc>
           <w:tcPr>
-            <w:tcW w:w="2772" w:type="dxa"/>
-            <w:tcBorders>
-              <w:left w:val="single" w:sz="4" w:space="0" w:color="000000"/>
-              <w:bottom w:val="single" w:sz="4" w:space="0" w:color="000000"/>
-              <w:right w:val="single" w:sz="4" w:space="0" w:color="000000"/>
-            </w:tcBorders>
-          </w:tcPr>
-          <w:p>
-            <w:pPr>
-              <w:pStyle w:val="TableContents"/>
-              <w:widowControl w:val="false"/>
-              <w:bidi w:val="0"/>
-              <w:jc w:val="left"/>
+            <w:tcW w:w="2773" w:type="dxa"/>
+            <w:tcBorders>
+              <w:start w:val="single" w:sz="4" w:space="0" w:color="000000"/>
+              <w:bottom w:val="single" w:sz="4" w:space="0" w:color="000000"/>
+              <w:end w:val="single" w:sz="4" w:space="0" w:color="000000"/>
+            </w:tcBorders>
+          </w:tcPr>
+          <w:p>
+            <w:pPr>
+              <w:pStyle w:val="TableContents"/>
+              <w:widowControl w:val="false"/>
+              <w:bidi w:val="0"/>
+              <w:jc w:val="start"/>
               <w:rPr/>
             </w:pPr>
             <w:r>
@@ -1952,7 +1955,7 @@
             <w:tcW w:w="2771" w:type="dxa"/>
             <w:vMerge w:val="continue"/>
             <w:tcBorders>
-              <w:left w:val="single" w:sz="4" w:space="0" w:color="000000"/>
+              <w:start w:val="single" w:sz="4" w:space="0" w:color="000000"/>
               <w:bottom w:val="single" w:sz="4" w:space="0" w:color="000000"/>
             </w:tcBorders>
             <w:vAlign w:val="center"/>
@@ -1975,7 +1978,7 @@
             <w:tcW w:w="2772" w:type="dxa"/>
             <w:vMerge w:val="continue"/>
             <w:tcBorders>
-              <w:left w:val="single" w:sz="4" w:space="0" w:color="000000"/>
+              <w:start w:val="single" w:sz="4" w:space="0" w:color="000000"/>
               <w:bottom w:val="single" w:sz="4" w:space="0" w:color="000000"/>
             </w:tcBorders>
             <w:vAlign w:val="center"/>
@@ -1997,7 +2000,7 @@
           <w:tcPr>
             <w:tcW w:w="2772" w:type="dxa"/>
             <w:tcBorders>
-              <w:left w:val="single" w:sz="4" w:space="0" w:color="000000"/>
+              <w:start w:val="single" w:sz="4" w:space="0" w:color="000000"/>
               <w:bottom w:val="single" w:sz="4" w:space="0" w:color="000000"/>
             </w:tcBorders>
             <w:vAlign w:val="center"/>
@@ -2018,19 +2021,19 @@
         </w:tc>
         <w:tc>
           <w:tcPr>
-            <w:tcW w:w="2772" w:type="dxa"/>
-            <w:tcBorders>
-              <w:left w:val="single" w:sz="4" w:space="0" w:color="000000"/>
-              <w:bottom w:val="single" w:sz="4" w:space="0" w:color="000000"/>
-              <w:right w:val="single" w:sz="4" w:space="0" w:color="000000"/>
-            </w:tcBorders>
-          </w:tcPr>
-          <w:p>
-            <w:pPr>
-              <w:pStyle w:val="TableContents"/>
-              <w:widowControl w:val="false"/>
-              <w:bidi w:val="0"/>
-              <w:jc w:val="left"/>
+            <w:tcW w:w="2773" w:type="dxa"/>
+            <w:tcBorders>
+              <w:start w:val="single" w:sz="4" w:space="0" w:color="000000"/>
+              <w:bottom w:val="single" w:sz="4" w:space="0" w:color="000000"/>
+              <w:end w:val="single" w:sz="4" w:space="0" w:color="000000"/>
+            </w:tcBorders>
+          </w:tcPr>
+          <w:p>
+            <w:pPr>
+              <w:pStyle w:val="TableContents"/>
+              <w:widowControl w:val="false"/>
+              <w:bidi w:val="0"/>
+              <w:jc w:val="start"/>
               <w:rPr/>
             </w:pPr>
             <w:r>
@@ -2045,29 +2048,29 @@
       <w:pPr>
         <w:pStyle w:val="Normal"/>
         <w:bidi w:val="0"/>
-        <w:jc w:val="left"/>
-        <w:rPr/>
-      </w:pPr>
-      <w:r>
-        <w:rPr/>
-      </w:r>
-    </w:p>
-    <w:p>
-      <w:pPr>
-        <w:pStyle w:val="Normal"/>
-        <w:bidi w:val="0"/>
-        <w:jc w:val="left"/>
-        <w:rPr/>
-      </w:pPr>
-      <w:r>
-        <w:rPr/>
-      </w:r>
-    </w:p>
-    <w:p>
-      <w:pPr>
-        <w:pStyle w:val="Normal"/>
-        <w:bidi w:val="0"/>
-        <w:jc w:val="left"/>
+        <w:jc w:val="start"/>
+        <w:rPr/>
+      </w:pPr>
+      <w:r>
+        <w:rPr/>
+      </w:r>
+    </w:p>
+    <w:p>
+      <w:pPr>
+        <w:pStyle w:val="Normal"/>
+        <w:bidi w:val="0"/>
+        <w:jc w:val="start"/>
+        <w:rPr/>
+      </w:pPr>
+      <w:r>
+        <w:rPr/>
+      </w:r>
+    </w:p>
+    <w:p>
+      <w:pPr>
+        <w:pStyle w:val="Normal"/>
+        <w:bidi w:val="0"/>
+        <w:jc w:val="start"/>
         <w:rPr/>
       </w:pPr>
       <w:r>
@@ -2085,7 +2088,7 @@
       <w:pPr>
         <w:pStyle w:val="Normal"/>
         <w:bidi w:val="0"/>
-        <w:jc w:val="left"/>
+        <w:jc w:val="start"/>
         <w:rPr/>
       </w:pPr>
       <w:r>
@@ -2111,7 +2114,7 @@
       <w:pPr>
         <w:pStyle w:val="Normal"/>
         <w:bidi w:val="0"/>
-        <w:jc w:val="left"/>
+        <w:jc w:val="start"/>
         <w:rPr/>
       </w:pPr>
       <w:r>
@@ -2157,7 +2160,7 @@
       <w:suppressAutoHyphens w:val="true"/>
       <w:bidi w:val="0"/>
       <w:spacing w:before="0" w:after="0"/>
-      <w:jc w:val="left"/>
+      <w:jc w:val="start"/>
     </w:pPr>
     <w:rPr>
       <w:rFonts w:ascii="Liberation Serif" w:hAnsi="Liberation Serif" w:eastAsia="Droid Sans Fallback" w:cs="Droid Sans Devanagari"/>
@@ -2171,7 +2174,7 @@
   <w:style w:type="paragraph" w:styleId="Heading">
     <w:name w:val="Heading"/>
     <w:basedOn w:val="Normal"/>
-    <w:next w:val="TextBody"/>
+    <w:next w:val="BodyText"/>
     <w:qFormat/>
     <w:pPr>
       <w:keepNext w:val="true"/>
@@ -2183,7 +2186,7 @@
       <w:szCs w:val="28"/>
     </w:rPr>
   </w:style>
-  <w:style w:type="paragraph" w:styleId="TextBody">
+  <w:style w:type="paragraph" w:styleId="BodyText">
     <w:name w:val="Body Text"/>
     <w:basedOn w:val="Normal"/>
     <w:pPr>
@@ -2193,14 +2196,14 @@
   </w:style>
   <w:style w:type="paragraph" w:styleId="List">
     <w:name w:val="List"/>
-    <w:basedOn w:val="TextBody"/>
+    <w:basedOn w:val="BodyText"/>
     <w:pPr/>
     <w:rPr>
       <w:rFonts w:cs="Droid Sans Devanagari"/>
     </w:rPr>
   </w:style>
   <w:style w:type="paragraph" w:styleId="Caption">
-    <w:name w:val="Caption"/>
+    <w:name w:val="caption"/>
     <w:basedOn w:val="Normal"/>
     <w:qFormat/>
     <w:pPr>
@@ -2237,4 +2240,110 @@
     <w:rPr/>
   </w:style>
 </w:styles>
+</file>
+
+<file path=word/theme/theme1.xml><?xml version="1.0" encoding="utf-8"?>
+<a:theme xmlns:a="http://schemas.openxmlformats.org/drawingml/2006/main" xmlns:r="http://schemas.openxmlformats.org/officeDocument/2006/relationships" name="Office">
+  <a:themeElements>
+    <a:clrScheme name="LibreOffice">
+      <a:dk1>
+        <a:srgbClr val="000000"/>
+      </a:dk1>
+      <a:lt1>
+        <a:srgbClr val="FFFFFF"/>
+      </a:lt1>
+      <a:dk2>
+        <a:srgbClr val="000000"/>
+      </a:dk2>
+      <a:lt2>
+        <a:srgbClr val="FFFFFF"/>
+      </a:lt2>
+      <a:accent1>
+        <a:srgbClr val="18A303"/>
+      </a:accent1>
+      <a:accent2>
+        <a:srgbClr val="0369A3"/>
+      </a:accent2>
+      <a:accent3>
+        <a:srgbClr val="A33E03"/>
+      </a:accent3>
+      <a:accent4>
+        <a:srgbClr val="8E03A3"/>
+      </a:accent4>
+      <a:accent5>
+        <a:srgbClr val="C99C00"/>
+      </a:accent5>
+      <a:accent6>
+        <a:srgbClr val="C9211E"/>
+      </a:accent6>
+      <a:hlink>
+        <a:srgbClr val="0000EE"/>
+      </a:hlink>
+      <a:folHlink>
+        <a:srgbClr val="551A8B"/>
+      </a:folHlink>
+    </a:clrScheme>
+    <a:fontScheme name="Office">
+      <a:majorFont>
+        <a:latin typeface="Arial" pitchFamily="0" charset="1"/>
+        <a:ea typeface="DejaVu Sans" pitchFamily="0" charset="1"/>
+        <a:cs typeface="DejaVu Sans" pitchFamily="0" charset="1"/>
+      </a:majorFont>
+      <a:minorFont>
+        <a:latin typeface="Arial" pitchFamily="0" charset="1"/>
+        <a:ea typeface="DejaVu Sans" pitchFamily="0" charset="1"/>
+        <a:cs typeface="DejaVu Sans" pitchFamily="0" charset="1"/>
+      </a:minorFont>
+    </a:fontScheme>
+    <a:fmtScheme>
+      <a:fillStyleLst>
+        <a:solidFill>
+          <a:schemeClr val="phClr"/>
+        </a:solidFill>
+        <a:solidFill>
+          <a:schemeClr val="phClr"/>
+        </a:solidFill>
+        <a:solidFill>
+          <a:schemeClr val="phClr"/>
+        </a:solidFill>
+      </a:fillStyleLst>
+      <a:lnStyleLst>
+        <a:ln w="6350" cap="flat" cmpd="sng" algn="ctr">
+          <a:prstDash val="solid"/>
+          <a:miter/>
+        </a:ln>
+        <a:ln w="6350" cap="flat" cmpd="sng" algn="ctr">
+          <a:prstDash val="solid"/>
+          <a:miter/>
+        </a:ln>
+        <a:ln w="6350" cap="flat" cmpd="sng" algn="ctr">
+          <a:prstDash val="solid"/>
+          <a:miter/>
+        </a:ln>
+      </a:lnStyleLst>
+      <a:effectStyleLst>
+        <a:effectStyle>
+          <a:effectLst/>
+        </a:effectStyle>
+        <a:effectStyle>
+          <a:effectLst/>
+        </a:effectStyle>
+        <a:effectStyle>
+          <a:effectLst/>
+        </a:effectStyle>
+      </a:effectStyleLst>
+      <a:bgFillStyleLst>
+        <a:solidFill>
+          <a:schemeClr val="phClr"/>
+        </a:solidFill>
+        <a:solidFill>
+          <a:schemeClr val="phClr"/>
+        </a:solidFill>
+        <a:solidFill>
+          <a:schemeClr val="phClr"/>
+        </a:solidFill>
+      </a:bgFillStyleLst>
+    </a:fmtScheme>
+  </a:themeElements>
+</a:theme>
 </file>
</xml_diff>